<commit_message>
Redo several SAP report files
SAP 6.2 Appendix: Tables by Sex. Add a Figure by sex for correlation between Viral Load and Immune Markers, with 8 bootstrap replicate figures.

SAP 6.4: Fix when best model  when it is '4pl'. Also save second.best.model for use later for PVE.

SAP 6.5_6.6: Was getting error in glm, use family=stats::gaussian to get around that error. For PVE use second best model when best model is not 'lm' or 'exp', so that can fit one of those two models with a nice linear predictor element.

Make Table S5.
</commit_message>
<xml_diff>
--- a/SAP Report/SAP Report Main.docx
+++ b/SAP Report/SAP Report Main.docx
@@ -1,6 +1,6 @@
 
 <file path=word/document.xml><?xml version="1.0" encoding="utf-8"?>
-<w:document xmlns:wpc="http://schemas.microsoft.com/office/word/2010/wordprocessingCanvas" xmlns:cx="http://schemas.microsoft.com/office/drawing/2014/chartex" xmlns:cx1="http://schemas.microsoft.com/office/drawing/2015/9/8/chartex" xmlns:cx2="http://schemas.microsoft.com/office/drawing/2015/10/21/chartex" xmlns:cx3="http://schemas.microsoft.com/office/drawing/2016/5/9/chartex" xmlns:cx4="http://schemas.microsoft.com/office/drawing/2016/5/10/chartex" xmlns:cx5="http://schemas.microsoft.com/office/drawing/2016/5/11/chartex" xmlns:cx6="http://schemas.microsoft.com/office/drawing/2016/5/12/chartex" xmlns:cx7="http://schemas.microsoft.com/office/drawing/2016/5/13/chartex" xmlns:cx8="http://schemas.microsoft.com/office/drawing/2016/5/14/chartex" xmlns:mc="http://schemas.openxmlformats.org/markup-compatibility/2006" xmlns:aink="http://schemas.microsoft.com/office/drawing/2016/ink" xmlns:am3d="http://schemas.microsoft.com/office/drawing/2017/model3d" xmlns:o="urn:schemas-microsoft-com:office:office" xmlns:oel="http://schemas.microsoft.com/office/2019/extlst" xmlns:r="http://schemas.openxmlformats.org/officeDocument/2006/relationships" xmlns:m="http://schemas.openxmlformats.org/officeDocument/2006/math" xmlns:v="urn:schemas-microsoft-com:vml" xmlns:wp14="http://schemas.microsoft.com/office/word/2010/wordprocessingDrawing" xmlns:wp="http://schemas.openxmlformats.org/drawingml/2006/wordprocessingDrawing" xmlns:w10="urn:schemas-microsoft-com:office:word" xmlns:w="http://schemas.openxmlformats.org/wordprocessingml/2006/main" xmlns:w14="http://schemas.microsoft.com/office/word/2010/wordml" xmlns:w15="http://schemas.microsoft.com/office/word/2012/wordml" xmlns:w16cex="http://schemas.microsoft.com/office/word/2018/wordml/cex" xmlns:w16cid="http://schemas.microsoft.com/office/word/2016/wordml/cid" xmlns:w16="http://schemas.microsoft.com/office/word/2018/wordml" xmlns:w16sdtdh="http://schemas.microsoft.com/office/word/2020/wordml/sdtdatahash" xmlns:w16se="http://schemas.microsoft.com/office/word/2015/wordml/symex" xmlns:wpg="http://schemas.microsoft.com/office/word/2010/wordprocessingGroup" xmlns:wpi="http://schemas.microsoft.com/office/word/2010/wordprocessingInk" xmlns:wne="http://schemas.microsoft.com/office/word/2006/wordml" xmlns:wps="http://schemas.microsoft.com/office/word/2010/wordprocessingShape" mc:Ignorable="w14 w15 w16se w16cid w16 w16cex w16sdtdh wp14">
+<w:document xmlns:wpc="http://schemas.microsoft.com/office/word/2010/wordprocessingCanvas" xmlns:cx="http://schemas.microsoft.com/office/drawing/2014/chartex" xmlns:cx1="http://schemas.microsoft.com/office/drawing/2015/9/8/chartex" xmlns:cx2="http://schemas.microsoft.com/office/drawing/2015/10/21/chartex" xmlns:cx3="http://schemas.microsoft.com/office/drawing/2016/5/9/chartex" xmlns:cx4="http://schemas.microsoft.com/office/drawing/2016/5/10/chartex" xmlns:cx5="http://schemas.microsoft.com/office/drawing/2016/5/11/chartex" xmlns:cx6="http://schemas.microsoft.com/office/drawing/2016/5/12/chartex" xmlns:cx7="http://schemas.microsoft.com/office/drawing/2016/5/13/chartex" xmlns:cx8="http://schemas.microsoft.com/office/drawing/2016/5/14/chartex" xmlns:mc="http://schemas.openxmlformats.org/markup-compatibility/2006" xmlns:aink="http://schemas.microsoft.com/office/drawing/2016/ink" xmlns:am3d="http://schemas.microsoft.com/office/drawing/2017/model3d" xmlns:o="urn:schemas-microsoft-com:office:office" xmlns:oel="http://schemas.microsoft.com/office/2019/extlst" xmlns:r="http://schemas.openxmlformats.org/officeDocument/2006/relationships" xmlns:m="http://schemas.openxmlformats.org/officeDocument/2006/math" xmlns:v="urn:schemas-microsoft-com:vml" xmlns:wp14="http://schemas.microsoft.com/office/word/2010/wordprocessingDrawing" xmlns:wp="http://schemas.openxmlformats.org/drawingml/2006/wordprocessingDrawing" xmlns:w10="urn:schemas-microsoft-com:office:word" xmlns:w="http://schemas.openxmlformats.org/wordprocessingml/2006/main" xmlns:w14="http://schemas.microsoft.com/office/word/2010/wordml" xmlns:w15="http://schemas.microsoft.com/office/word/2012/wordml" xmlns:w16cex="http://schemas.microsoft.com/office/word/2018/wordml/cex" xmlns:w16cid="http://schemas.microsoft.com/office/word/2016/wordml/cid" xmlns:w16="http://schemas.microsoft.com/office/word/2018/wordml" xmlns:w16du="http://schemas.microsoft.com/office/word/2023/wordml/word16du" xmlns:w16sdtdh="http://schemas.microsoft.com/office/word/2020/wordml/sdtdatahash" xmlns:w16sdtfl="http://schemas.microsoft.com/office/word/2024/wordml/sdtformatlock" xmlns:w16se="http://schemas.microsoft.com/office/word/2015/wordml/symex" xmlns:wpg="http://schemas.microsoft.com/office/word/2010/wordprocessingGroup" xmlns:wpi="http://schemas.microsoft.com/office/word/2010/wordprocessingInk" xmlns:wne="http://schemas.microsoft.com/office/word/2006/wordml" xmlns:wps="http://schemas.microsoft.com/office/word/2010/wordprocessingShape" mc:Ignorable="w14 w15 w16se w16cid w16 w16cex w16sdtdh w16sdtfl w16du wp14">
   <w:body>
     <w:p>
       <w:pPr>
@@ -20,9 +20,21 @@
       </w:r>
     </w:p>
     <w:p>
-      <w:r>
-        <w:t>May 27, 2025</w:t>
-      </w:r>
+      <w:del w:id="0" w:author="Fay, Michael (NIH/NIAID) [E]" w:date="2026-09-24T13:25:00Z" w16du:dateUtc="2026-09-24T17:25:00Z">
+        <w:r>
+          <w:delText>May 27</w:delText>
+        </w:r>
+      </w:del>
+      <w:del w:id="1" w:author="Fay, Michael (NIH/NIAID) [E]" w:date="2026-09-24T13:26:00Z" w16du:dateUtc="2026-09-24T17:26:00Z">
+        <w:r>
+          <w:delText>, 2025</w:delText>
+        </w:r>
+      </w:del>
+      <w:ins w:id="2" w:author="Fay, Michael (NIH/NIAID) [E]" w:date="2026-09-24T13:26:00Z" w16du:dateUtc="2026-09-24T17:26:00Z">
+        <w:r>
+          <w:t>September 24, 2026</w:t>
+        </w:r>
+      </w:ins>
     </w:p>
     <w:p/>
     <w:sdt>
@@ -908,11 +920,11 @@
       <w:pPr>
         <w:pStyle w:val="Heading1"/>
       </w:pPr>
-      <w:bookmarkStart w:id="0" w:name="_Toc139630290"/>
+      <w:bookmarkStart w:id="3" w:name="_Toc139630290"/>
       <w:r>
         <w:t>Summary</w:t>
       </w:r>
-      <w:bookmarkEnd w:id="0"/>
+      <w:bookmarkEnd w:id="3"/>
     </w:p>
     <w:p/>
     <w:p>
@@ -950,15 +962,7 @@
         <w:t xml:space="preserve">examined </w:t>
       </w:r>
       <w:r>
-        <w:t xml:space="preserve">8 different antibody </w:t>
-      </w:r>
-      <w:proofErr w:type="gramStart"/>
-      <w:r>
-        <w:t>measurements</w:t>
-      </w:r>
-      <w:proofErr w:type="gramEnd"/>
-      <w:r>
-        <w:t xml:space="preserve"> and 12 </w:t>
+        <w:t xml:space="preserve">8 different antibody measurements and 12 </w:t>
       </w:r>
       <w:r>
         <w:lastRenderedPageBreak/>
@@ -1021,7 +1025,6 @@
       <w:r>
         <w:t xml:space="preserve"> MN</w:t>
       </w:r>
-      <w:proofErr w:type="gramStart"/>
       <w:r>
         <w:rPr>
           <w:vertAlign w:val="subscript"/>
@@ -1032,11 +1035,7 @@
         <w:t xml:space="preserve"> </w:t>
       </w:r>
       <w:r>
-        <w:t xml:space="preserve"> values</w:t>
-      </w:r>
-      <w:proofErr w:type="gramEnd"/>
-      <w:r>
-        <w:t xml:space="preserve">  </w:t>
+        <w:t xml:space="preserve"> values  </w:t>
       </w:r>
       <w:r>
         <w:t>as determined by</w:t>
@@ -1102,18 +1101,10 @@
         <w:t xml:space="preserve"> </w:t>
       </w:r>
       <w:r>
-        <w:t xml:space="preserve">model fit and 95% confidence </w:t>
-      </w:r>
-      <w:proofErr w:type="gramStart"/>
-      <w:r>
-        <w:t xml:space="preserve">region </w:t>
-      </w:r>
-      <w:r>
-        <w:t xml:space="preserve"> for</w:t>
-      </w:r>
-      <w:proofErr w:type="gramEnd"/>
-      <w:r>
-        <w:t xml:space="preserve"> th</w:t>
+        <w:t xml:space="preserve">model fit and 95% confidence region </w:t>
+      </w:r>
+      <w:r>
+        <w:t xml:space="preserve"> for th</w:t>
       </w:r>
       <w:r>
         <w:t>at</w:t>
@@ -1145,7 +1136,6 @@
       <w:r>
         <w:t xml:space="preserve">odels </w:t>
       </w:r>
-      <w:proofErr w:type="gramStart"/>
       <w:r>
         <w:t>using</w:t>
       </w:r>
@@ -1156,145 +1146,130 @@
         <w:t xml:space="preserve"> </w:t>
       </w:r>
       <w:r>
-        <w:t>only</w:t>
-      </w:r>
-      <w:proofErr w:type="gramEnd"/>
-      <w:r>
-        <w:t xml:space="preserve"> a single type of </w:t>
+        <w:t xml:space="preserve">only a single type of </w:t>
       </w:r>
       <w:r>
         <w:t xml:space="preserve"> antibody measurement</w:t>
       </w:r>
       <w:r>
+        <w:t xml:space="preserve"> (i.e., one of the 8 different types of antibody measurements) </w:t>
+      </w:r>
+      <w:r>
+        <w:t xml:space="preserve"> only</w:t>
+      </w:r>
+      <w:r>
+        <w:t xml:space="preserve"> predict</w:t>
+      </w:r>
+      <w:r>
+        <w:t>ed</w:t>
+      </w:r>
+      <w:r>
+        <w:t xml:space="preserve"> a</w:t>
+      </w:r>
+      <w:r>
+        <w:t>t least 50%</w:t>
+      </w:r>
+      <w:r>
         <w:t xml:space="preserve"> </w:t>
       </w:r>
       <w:r>
-        <w:t xml:space="preserve">(i.e., one of the 8 different types of antibody measurements) </w:t>
-      </w:r>
-      <w:r>
-        <w:t xml:space="preserve"> only</w:t>
-      </w:r>
-      <w:r>
-        <w:t xml:space="preserve"> predict</w:t>
+        <w:t>of the variability</w:t>
+      </w:r>
+      <w:r>
+        <w:t xml:space="preserve"> of the viral load measurement</w:t>
+      </w:r>
+      <w:r>
+        <w:t xml:space="preserve"> </w:t>
+      </w:r>
+      <w:r>
+        <w:t>compared</w:t>
+      </w:r>
+      <w:r>
+        <w:t xml:space="preserve"> to </w:t>
+      </w:r>
+      <w:r>
+        <w:t xml:space="preserve">the </w:t>
+      </w:r>
+      <w:r>
+        <w:t>models that include</w:t>
+      </w:r>
+      <w:r>
+        <w:t>d</w:t>
+      </w:r>
+      <w:r>
+        <w:t xml:space="preserve"> vaccine type and dose</w:t>
+      </w:r>
+      <w:r>
+        <w:t xml:space="preserve"> in addition to </w:t>
+      </w:r>
+      <w:r>
+        <w:t>the</w:t>
+      </w:r>
+      <w:r>
+        <w:t xml:space="preserve"> singl</w:t>
+      </w:r>
+      <w:r>
+        <w:t>e antibody measurement</w:t>
+      </w:r>
+      <w:r>
+        <w:t xml:space="preserve">. For the </w:t>
+      </w:r>
+      <w:r>
+        <w:t xml:space="preserve">same </w:t>
+      </w:r>
+      <w:r>
+        <w:t>viral load/antibody combination</w:t>
+      </w:r>
+      <w:r>
+        <w:t xml:space="preserve"> reference</w:t>
+      </w:r>
+      <w:r>
+        <w:t>d</w:t>
+      </w:r>
+      <w:r>
+        <w:t xml:space="preserve"> above</w:t>
+      </w:r>
+      <w:r>
+        <w:t>, the</w:t>
+      </w:r>
+      <w:r>
+        <w:t xml:space="preserve"> </w:t>
+      </w:r>
+      <w:r>
+        <w:t xml:space="preserve">model with only antibody </w:t>
+      </w:r>
+      <w:r>
+        <w:t xml:space="preserve">explained </w:t>
+      </w:r>
+      <w:r>
+        <w:t>98.2% (95% CI: 96.63%, 100%)</w:t>
+      </w:r>
+      <w:r>
+        <w:t xml:space="preserve"> of the variance compared to a model that additionally </w:t>
+      </w:r>
+      <w:r>
+        <w:t xml:space="preserve">allowed </w:t>
+      </w:r>
+      <w:r>
+        <w:t xml:space="preserve">different linear </w:t>
+      </w:r>
+      <w:r>
+        <w:t xml:space="preserve">dose </w:t>
+      </w:r>
+      <w:r>
+        <w:t>effects for each vaccine</w:t>
+      </w:r>
+      <w:r>
+        <w:t xml:space="preserve">. </w:t>
+      </w:r>
+      <w:r>
+        <w:t>To mimic how the antibody might be used as a correlate of protection, for each vaccine type we consider</w:t>
       </w:r>
       <w:r>
         <w:t>ed</w:t>
       </w:r>
       <w:r>
-        <w:t xml:space="preserve"> a</w:t>
-      </w:r>
-      <w:r>
-        <w:t>t least 50%</w:t>
-      </w:r>
-      <w:r>
-        <w:t xml:space="preserve"> </w:t>
-      </w:r>
-      <w:r>
-        <w:t>of the variability</w:t>
-      </w:r>
-      <w:r>
-        <w:t xml:space="preserve"> of the viral load measurement</w:t>
-      </w:r>
-      <w:r>
-        <w:t xml:space="preserve"> </w:t>
-      </w:r>
-      <w:r>
-        <w:t>compared</w:t>
-      </w:r>
-      <w:r>
-        <w:t xml:space="preserve"> to </w:t>
-      </w:r>
-      <w:r>
-        <w:t xml:space="preserve">the </w:t>
-      </w:r>
-      <w:r>
-        <w:t>models that include</w:t>
-      </w:r>
-      <w:r>
-        <w:t>d</w:t>
-      </w:r>
-      <w:r>
-        <w:t xml:space="preserve"> vaccine type and dose</w:t>
-      </w:r>
-      <w:r>
-        <w:t xml:space="preserve"> in addition to </w:t>
-      </w:r>
-      <w:r>
-        <w:t>the</w:t>
-      </w:r>
-      <w:r>
-        <w:t xml:space="preserve"> singl</w:t>
-      </w:r>
-      <w:r>
-        <w:t>e antibody measurement</w:t>
-      </w:r>
-      <w:r>
-        <w:t xml:space="preserve">. For the </w:t>
-      </w:r>
-      <w:r>
-        <w:t xml:space="preserve">same </w:t>
-      </w:r>
-      <w:r>
-        <w:t>viral load/antibody combination</w:t>
-      </w:r>
-      <w:r>
-        <w:t xml:space="preserve"> reference</w:t>
-      </w:r>
-      <w:r>
-        <w:t>d</w:t>
-      </w:r>
-      <w:r>
-        <w:t xml:space="preserve"> above</w:t>
-      </w:r>
-      <w:r>
-        <w:t>, the</w:t>
-      </w:r>
-      <w:r>
-        <w:t xml:space="preserve"> </w:t>
-      </w:r>
-      <w:r>
-        <w:t xml:space="preserve">model with only antibody </w:t>
-      </w:r>
-      <w:r>
-        <w:t xml:space="preserve">explained </w:t>
-      </w:r>
-      <w:r>
-        <w:t>98.2% (95% CI: 96.63%, 100%)</w:t>
-      </w:r>
-      <w:r>
-        <w:t xml:space="preserve"> of the variance compared to a model that additionally </w:t>
-      </w:r>
-      <w:r>
-        <w:t xml:space="preserve">allowed </w:t>
-      </w:r>
-      <w:r>
-        <w:t xml:space="preserve">different linear </w:t>
-      </w:r>
-      <w:r>
-        <w:t xml:space="preserve">dose </w:t>
-      </w:r>
-      <w:r>
-        <w:t>effects for each vaccine</w:t>
-      </w:r>
-      <w:r>
-        <w:t xml:space="preserve">. </w:t>
-      </w:r>
-      <w:r>
-        <w:t>To mimic how the antibody might be used as a correlate of protection, for each vaccine type we consider</w:t>
-      </w:r>
-      <w:r>
-        <w:t>ed</w:t>
-      </w:r>
-      <w:r>
-        <w:t xml:space="preserve"> using the other 3 vaccine types to build a prediction model for viral load for NHPs given that </w:t>
-      </w:r>
-      <w:proofErr w:type="gramStart"/>
-      <w:r>
-        <w:t>vaccine, and</w:t>
-      </w:r>
-      <w:proofErr w:type="gramEnd"/>
-      <w:r>
-        <w:t xml:space="preserve"> see how well that prediction model agrees with the actual viral load </w:t>
+        <w:t xml:space="preserve"> using the other 3 vaccine types to build a prediction model for viral load for NHPs given that vaccine, and see how well that prediction model agrees with the actual viral load </w:t>
       </w:r>
       <w:r>
         <w:t>measu</w:t>
@@ -1419,11 +1394,11 @@
       <w:pPr>
         <w:pStyle w:val="Heading1"/>
       </w:pPr>
-      <w:bookmarkStart w:id="1" w:name="_Toc139630291"/>
+      <w:bookmarkStart w:id="4" w:name="_Toc139630291"/>
       <w:r>
         <w:t>Introduction: Study Design and Variables of Interest</w:t>
       </w:r>
-      <w:bookmarkEnd w:id="1"/>
+      <w:bookmarkEnd w:id="4"/>
     </w:p>
     <w:p/>
     <w:p>
@@ -1766,14 +1741,7 @@
       </w:r>
       <w:r>
         <w:tab/>
-      </w:r>
-      <w:proofErr w:type="spellStart"/>
-      <w:r>
-        <w:t>Meso</w:t>
-      </w:r>
-      <w:proofErr w:type="spellEnd"/>
-      <w:r>
-        <w:t xml:space="preserve"> scale discovery electrochemiluminescence immunoassay</w:t>
+        <w:t>Meso scale discovery electrochemiluminescence immunoassay</w:t>
       </w:r>
     </w:p>
     <w:p>
@@ -1784,11 +1752,9 @@
           <w:numId w:val="1"/>
         </w:numPr>
       </w:pPr>
-      <w:proofErr w:type="spellStart"/>
       <w:r>
         <w:t>PsVNA</w:t>
       </w:r>
-      <w:proofErr w:type="spellEnd"/>
       <w:r>
         <w:t xml:space="preserve"> ID50</w:t>
       </w:r>
@@ -1799,15 +1765,7 @@
         <w:tab/>
       </w:r>
       <w:r>
-        <w:t xml:space="preserve"> </w:t>
-      </w:r>
-      <w:proofErr w:type="spellStart"/>
-      <w:r>
-        <w:t>Pseudovirus</w:t>
-      </w:r>
-      <w:proofErr w:type="spellEnd"/>
-      <w:r>
-        <w:t xml:space="preserve"> neutralizing assay</w:t>
+        <w:t xml:space="preserve"> Pseudovirus neutralizing assay</w:t>
       </w:r>
       <w:r>
         <w:t xml:space="preserve">, 50% inhibitory dose </w:t>
@@ -1821,11 +1779,9 @@
           <w:numId w:val="1"/>
         </w:numPr>
       </w:pPr>
-      <w:proofErr w:type="spellStart"/>
       <w:r>
         <w:t>PsVNA</w:t>
       </w:r>
-      <w:proofErr w:type="spellEnd"/>
       <w:r>
         <w:t xml:space="preserve"> ID80:</w:t>
       </w:r>
@@ -1833,15 +1789,7 @@
         <w:tab/>
       </w:r>
       <w:r>
-        <w:t xml:space="preserve"> </w:t>
-      </w:r>
-      <w:proofErr w:type="spellStart"/>
-      <w:r>
-        <w:t>Pseudovirus</w:t>
-      </w:r>
-      <w:proofErr w:type="spellEnd"/>
-      <w:r>
-        <w:t xml:space="preserve"> neutralizing assay</w:t>
+        <w:t xml:space="preserve"> Pseudovirus neutralizing assay</w:t>
       </w:r>
       <w:r>
         <w:t xml:space="preserve">, 80% inhibitory dose </w:t>
@@ -2030,7 +1978,7 @@
           <w:numId w:val="3"/>
         </w:numPr>
       </w:pPr>
-      <w:bookmarkStart w:id="2" w:name="_Hlk139900884"/>
+      <w:bookmarkStart w:id="5" w:name="_Hlk139900884"/>
       <w:r>
         <w:t>AUC:</w:t>
       </w:r>
@@ -2038,7 +1986,7 @@
         <w:tab/>
         <w:t xml:space="preserve"> </w:t>
       </w:r>
-      <w:bookmarkStart w:id="3" w:name="_Hlk139900864"/>
+      <w:bookmarkStart w:id="6" w:name="_Hlk139900864"/>
       <w:r>
         <w:rPr>
           <w:rFonts w:eastAsia="Times New Roman"/>
@@ -2093,9 +2041,9 @@
         </w:rPr>
         <w:t>9 post challenge using the trapezoid rule with Day 0 values imputed from Study Day -14, and (untransformed) values below the limit of detection (LOD) set to LOD/2.</w:t>
       </w:r>
-      <w:bookmarkEnd w:id="3"/>
+      <w:bookmarkEnd w:id="6"/>
     </w:p>
-    <w:bookmarkEnd w:id="2"/>
+    <w:bookmarkEnd w:id="5"/>
     <w:p>
       <w:r>
         <w:t xml:space="preserve">and two </w:t>
@@ -2139,27 +2087,14 @@
           <w:numId w:val="4"/>
         </w:numPr>
       </w:pPr>
-      <w:proofErr w:type="spellStart"/>
-      <w:r>
-        <w:t>Subgenomic</w:t>
-      </w:r>
-      <w:proofErr w:type="spellEnd"/>
-      <w:r>
-        <w:t xml:space="preserve">: </w:t>
+      <w:r>
+        <w:t xml:space="preserve">Subgenomic: </w:t>
       </w:r>
       <w:r>
         <w:tab/>
       </w:r>
       <w:r>
-        <w:t xml:space="preserve">RT-qPCR of the Small Envelope Protein (E) Gene </w:t>
-      </w:r>
-      <w:proofErr w:type="spellStart"/>
-      <w:r>
-        <w:t>Subgenomic</w:t>
-      </w:r>
-      <w:proofErr w:type="spellEnd"/>
-      <w:r>
-        <w:t xml:space="preserve"> RNA</w:t>
+        <w:t>RT-qPCR of the Small Envelope Protein (E) Gene Subgenomic RNA</w:t>
       </w:r>
     </w:p>
     <w:p/>
@@ -2215,11 +2150,11 @@
       <w:pPr>
         <w:pStyle w:val="Heading1"/>
       </w:pPr>
-      <w:bookmarkStart w:id="4" w:name="_Toc139630292"/>
+      <w:bookmarkStart w:id="7" w:name="_Toc139630292"/>
       <w:r>
         <w:t>Overall Association between Virus Specific Antibody and Viral Load (Section 6.2)</w:t>
       </w:r>
-      <w:bookmarkEnd w:id="4"/>
+      <w:bookmarkEnd w:id="7"/>
     </w:p>
     <w:p/>
     <w:p>
@@ -2234,11 +2169,7 @@
         <w:t>8 antibody measurements (4</w:t>
       </w:r>
       <w:r>
-        <w:t xml:space="preserve"> ways of </w:t>
-      </w:r>
-      <w:proofErr w:type="gramStart"/>
-      <w:r>
-        <w:t>measuring</w:t>
+        <w:t xml:space="preserve"> ways of measuring</w:t>
       </w:r>
       <w:r>
         <w:t xml:space="preserve"> </w:t>
@@ -2246,7 +2177,6 @@
       <w:r>
         <w:t xml:space="preserve"> the</w:t>
       </w:r>
-      <w:proofErr w:type="gramEnd"/>
       <w:r>
         <w:t xml:space="preserve"> </w:t>
       </w:r>
@@ -2408,9 +2338,16 @@
       <w:r>
         <w:t>.</w:t>
       </w:r>
-      <w:r>
-        <w:t>2</w:t>
-      </w:r>
+      <w:ins w:id="8" w:author="Fay, Michael (NIH/NIAID) [E]" w:date="2026-09-24T16:39:00Z" w16du:dateUtc="2026-09-24T20:39:00Z">
+        <w:r>
+          <w:t>3</w:t>
+        </w:r>
+      </w:ins>
+      <w:del w:id="9" w:author="Fay, Michael (NIH/NIAID) [E]" w:date="2026-09-24T16:39:00Z" w16du:dateUtc="2026-09-24T20:39:00Z">
+        <w:r>
+          <w:delText>2</w:delText>
+        </w:r>
+      </w:del>
       <w:r>
         <w:t>)</w:t>
       </w:r>
@@ -2617,15 +2554,7 @@
     </w:p>
     <w:p>
       <w:r>
-        <w:t xml:space="preserve">where the detectable virus is measured at Day 2 post challenge in 6 ways (each of the </w:t>
-      </w:r>
-      <w:proofErr w:type="gramStart"/>
-      <w:r>
-        <w:t>3 collection</w:t>
-      </w:r>
-      <w:proofErr w:type="gramEnd"/>
-      <w:r>
-        <w:t xml:space="preserve"> location/methods at each of the 2 viral load measurement methods), and using each of the 8 virus specific antibody assay time/methods.  </w:t>
+        <w:t xml:space="preserve">where the detectable virus is measured at Day 2 post challenge in 6 ways (each of the 3 collection location/methods at each of the 2 viral load measurement methods), and using each of the 8 virus specific antibody assay time/methods.  </w:t>
       </w:r>
       <w:r>
         <w:t>Table 6.2</w:t>
@@ -2633,92 +2562,78 @@
       <w:r>
         <w:t>.</w:t>
       </w:r>
-      <w:r>
-        <w:t xml:space="preserve">3 </w:t>
+      <w:ins w:id="10" w:author="Fay, Michael (NIH/NIAID) [E]" w:date="2026-09-24T16:46:00Z" w16du:dateUtc="2026-09-24T20:46:00Z">
+        <w:r>
+          <w:t>4</w:t>
+        </w:r>
+      </w:ins>
+      <w:del w:id="11" w:author="Fay, Michael (NIH/NIAID) [E]" w:date="2026-09-24T16:46:00Z" w16du:dateUtc="2026-09-24T20:46:00Z">
+        <w:r>
+          <w:delText>3</w:delText>
+        </w:r>
+      </w:del>
+      <w:r>
+        <w:t xml:space="preserve"> </w:t>
       </w:r>
       <w:r>
         <w:t xml:space="preserve">shows the </w:t>
       </w:r>
       <w:r>
-        <w:t xml:space="preserve">ratios </w:t>
-      </w:r>
-      <w:proofErr w:type="gramStart"/>
+        <w:t xml:space="preserve">ratios were </w:t>
+      </w:r>
+      <w:r>
+        <w:t xml:space="preserve"> s</w:t>
+      </w:r>
+      <w:r>
+        <w:t>ignificantly less than 1, ranging from 0.02 to 0.27</w:t>
+      </w:r>
+      <w:r>
+        <w:t>. G</w:t>
+      </w:r>
+      <w:r>
+        <w:t>enerally</w:t>
+      </w:r>
+      <w:r>
+        <w:t>,</w:t>
+      </w:r>
+      <w:r>
+        <w:t xml:space="preserve"> </w:t>
+      </w:r>
+      <w:r>
+        <w:t xml:space="preserve">we </w:t>
+      </w:r>
+      <w:r>
+        <w:t>observed</w:t>
+      </w:r>
+      <w:r>
+        <w:t xml:space="preserve"> </w:t>
+      </w:r>
+      <w:r>
+        <w:t xml:space="preserve">slightly </w:t>
+      </w:r>
+      <w:r>
+        <w:t>more extreme (i.e., lower)</w:t>
+      </w:r>
+      <w:r>
+        <w:t xml:space="preserve"> values using virus specific antibody measurements 2 weeks prior to challenge compared to measurements on the day of challenge.  </w:t>
+      </w:r>
+      <w:r>
+        <w:t xml:space="preserve">Further, the N1 </w:t>
+      </w:r>
+      <w:r>
+        <w:t xml:space="preserve">viral load measurements </w:t>
+      </w:r>
       <w:r>
         <w:t xml:space="preserve">were </w:t>
       </w:r>
       <w:r>
-        <w:t xml:space="preserve"> s</w:t>
-      </w:r>
-      <w:r>
-        <w:t>ignificantly</w:t>
-      </w:r>
-      <w:proofErr w:type="gramEnd"/>
-      <w:r>
-        <w:t xml:space="preserve"> less than 1, ranging from 0.02 to 0.27</w:t>
-      </w:r>
-      <w:r>
-        <w:t>. G</w:t>
-      </w:r>
-      <w:r>
-        <w:t>enerally</w:t>
-      </w:r>
-      <w:r>
-        <w:t>,</w:t>
-      </w:r>
-      <w:r>
-        <w:t xml:space="preserve"> </w:t>
-      </w:r>
-      <w:r>
-        <w:t xml:space="preserve">we </w:t>
-      </w:r>
-      <w:r>
-        <w:t>observed</w:t>
-      </w:r>
-      <w:r>
-        <w:t xml:space="preserve"> </w:t>
-      </w:r>
-      <w:r>
-        <w:t xml:space="preserve">slightly </w:t>
-      </w:r>
-      <w:r>
-        <w:t>more extreme (i.e., lower)</w:t>
-      </w:r>
-      <w:r>
-        <w:t xml:space="preserve"> values using virus specific antibody measurements 2 weeks prior to challenge compared to measurements on the day of challenge.  </w:t>
-      </w:r>
-      <w:r>
-        <w:t xml:space="preserve">Further, the N1 </w:t>
-      </w:r>
-      <w:r>
-        <w:t xml:space="preserve">viral load measurements </w:t>
-      </w:r>
-      <w:r>
-        <w:t xml:space="preserve">were </w:t>
-      </w:r>
-      <w:r>
-        <w:t xml:space="preserve">slightly more </w:t>
-      </w:r>
-      <w:proofErr w:type="gramStart"/>
-      <w:r>
-        <w:t xml:space="preserve">extreme </w:t>
-      </w:r>
-      <w:r>
-        <w:t xml:space="preserve"> (</w:t>
-      </w:r>
-      <w:proofErr w:type="gramEnd"/>
-      <w:r>
-        <w:t xml:space="preserve">i.e., lower) </w:t>
-      </w:r>
-      <w:r>
-        <w:t xml:space="preserve">than their corresponding </w:t>
-      </w:r>
-      <w:proofErr w:type="spellStart"/>
-      <w:r>
-        <w:t>subgenomic</w:t>
-      </w:r>
-      <w:proofErr w:type="spellEnd"/>
-      <w:r>
-        <w:t xml:space="preserve"> measurements.</w:t>
+        <w:t xml:space="preserve">slightly more extreme </w:t>
+      </w:r>
+      <w:r>
+        <w:t xml:space="preserve"> (i.e., lower) </w:t>
+      </w:r>
+      <w:r>
+        <w:t>than their corresponding subgenomic measurements.</w:t>
       </w:r>
     </w:p>
     <w:p/>
@@ -2726,14 +2641,14 @@
       <w:pPr>
         <w:pStyle w:val="Heading1"/>
       </w:pPr>
-      <w:bookmarkStart w:id="5" w:name="_Toc139630293"/>
+      <w:bookmarkStart w:id="12" w:name="_Toc139630293"/>
       <w:r>
         <w:t>Dose Response of Vaccine Product on Virus Specific Antibody</w:t>
       </w:r>
       <w:r>
         <w:t xml:space="preserve"> (Section 6.3)</w:t>
       </w:r>
-      <w:bookmarkEnd w:id="5"/>
+      <w:bookmarkEnd w:id="12"/>
     </w:p>
     <w:p>
       <w:pPr>
@@ -2820,38 +2735,30 @@
         <w:t xml:space="preserve">was </w:t>
       </w:r>
       <w:r>
-        <w:t xml:space="preserve">Janssen, </w:t>
-      </w:r>
-      <w:proofErr w:type="gramStart"/>
-      <w:r>
-        <w:t xml:space="preserve">which </w:t>
-      </w:r>
-      <w:r>
-        <w:t xml:space="preserve"> also</w:t>
-      </w:r>
-      <w:proofErr w:type="gramEnd"/>
+        <w:t xml:space="preserve">Janssen, which </w:t>
+      </w:r>
+      <w:r>
+        <w:t xml:space="preserve"> also </w:t>
+      </w:r>
+      <w:r>
+        <w:t xml:space="preserve">had </w:t>
+      </w:r>
+      <w:r>
+        <w:t xml:space="preserve">four </w:t>
+      </w:r>
+      <w:r>
+        <w:t xml:space="preserve">arms with a single </w:t>
+      </w:r>
+      <w:r>
+        <w:t>immunization</w:t>
+      </w:r>
+      <w:r>
+        <w:t>.</w:t>
+      </w:r>
       <w:r>
         <w:t xml:space="preserve"> </w:t>
       </w:r>
       <w:r>
-        <w:t xml:space="preserve">had </w:t>
-      </w:r>
-      <w:r>
-        <w:t xml:space="preserve">four </w:t>
-      </w:r>
-      <w:r>
-        <w:t xml:space="preserve">arms with a single </w:t>
-      </w:r>
-      <w:r>
-        <w:t>immunization</w:t>
-      </w:r>
-      <w:r>
-        <w:t>.</w:t>
-      </w:r>
-      <w:r>
-        <w:t xml:space="preserve"> </w:t>
-      </w:r>
-      <w:r>
         <w:t>Within each vaccine</w:t>
       </w:r>
       <w:r>
@@ -2864,11 +2771,7 @@
         <w:t xml:space="preserve">, </w:t>
       </w:r>
       <w:r>
-        <w:t xml:space="preserve">if D is the dose for the arm and </w:t>
-      </w:r>
-      <w:proofErr w:type="spellStart"/>
-      <w:r>
-        <w:t>D</w:t>
+        <w:t>if D is the dose for the arm and D</w:t>
       </w:r>
       <w:r>
         <w:rPr>
@@ -2876,7 +2779,6 @@
         </w:rPr>
         <w:t>min</w:t>
       </w:r>
-      <w:proofErr w:type="spellEnd"/>
       <w:r>
         <w:t xml:space="preserve"> is the minimum dose among all arms for that vaccine, then the dose score is </w:t>
       </w:r>
@@ -3035,15 +2937,7 @@
         <w:t xml:space="preserve"> and a value of 3 is 100 times the minimum dose</w:t>
       </w:r>
       <w:r>
-        <w:t xml:space="preserve">, </w:t>
-      </w:r>
-      <w:proofErr w:type="gramStart"/>
-      <w:r>
-        <w:t>etc..</w:t>
-      </w:r>
-      <w:proofErr w:type="gramEnd"/>
-      <w:r>
-        <w:t xml:space="preserve"> </w:t>
+        <w:t xml:space="preserve">, etc.. </w:t>
       </w:r>
       <w:r>
         <w:t xml:space="preserve"> The </w:t>
@@ -3156,13 +3050,8 @@
           <w:numId w:val="5"/>
         </w:numPr>
       </w:pPr>
-      <w:proofErr w:type="gramStart"/>
-      <w:r>
-        <w:t>Janssen(</w:t>
-      </w:r>
-      <w:proofErr w:type="gramEnd"/>
-      <w:r>
-        <w:t>2 dose) means that the single immunization arms are ignored</w:t>
+      <w:r>
+        <w:t>Janssen(2 dose) means that the single immunization arms are ignored</w:t>
       </w:r>
       <w:r>
         <w:t xml:space="preserve"> and only the 2 </w:t>
@@ -3197,15 +3086,7 @@
         <w:t xml:space="preserve"> scores</w:t>
       </w:r>
       <w:r>
-        <w:t xml:space="preserve"> </w:t>
-      </w:r>
-      <w:proofErr w:type="gramStart"/>
-      <w:r>
-        <w:t>are connected with</w:t>
-      </w:r>
-      <w:proofErr w:type="gramEnd"/>
-      <w:r>
-        <w:t xml:space="preserve"> dotted lines in the graph). </w:t>
+        <w:t xml:space="preserve"> are connected with dotted lines in the graph). </w:t>
       </w:r>
       <w:r>
         <w:t xml:space="preserve"> For this summary, we focus on the overall scores using Janssen(s=1/2) (the single dose halved dose score)</w:t>
@@ -3266,27 +3147,14 @@
                             <w:r>
                               <w:t xml:space="preserve">Figure </w:t>
                             </w:r>
-                            <w:r>
-                              <w:fldChar w:fldCharType="begin"/>
-                            </w:r>
-                            <w:r>
-                              <w:instrText xml:space="preserve"> SEQ Figure \* ARABIC </w:instrText>
-                            </w:r>
-                            <w:r>
-                              <w:fldChar w:fldCharType="separate"/>
-                            </w:r>
-                            <w:r>
-                              <w:rPr>
-                                <w:noProof/>
-                              </w:rPr>
-                              <w:t>1</w:t>
-                            </w:r>
-                            <w:r>
-                              <w:rPr>
-                                <w:noProof/>
-                              </w:rPr>
-                              <w:fldChar w:fldCharType="end"/>
-                            </w:r>
+                            <w:fldSimple w:instr=" SEQ Figure \* ARABIC ">
+                              <w:r>
+                                <w:rPr>
+                                  <w:noProof/>
+                                </w:rPr>
+                                <w:t>1</w:t>
+                              </w:r>
+                            </w:fldSimple>
                             <w:r>
                               <w:t>: Dose scores</w:t>
                             </w:r>
@@ -3564,13 +3432,8 @@
       <w:r>
         <w:t xml:space="preserve">was </w:t>
       </w:r>
-      <w:proofErr w:type="gramStart"/>
-      <w:r>
-        <w:t>still  significant</w:t>
-      </w:r>
-      <w:proofErr w:type="gramEnd"/>
-      <w:r>
-        <w:t xml:space="preserve"> for all 8 ways (Spearman correlations all significant, </w:t>
+      <w:r>
+        <w:t xml:space="preserve">still  significant for all 8 ways (Spearman correlations all significant, </w:t>
       </w:r>
       <w:r>
         <w:t xml:space="preserve">ranging from </w:t>
@@ -3681,7 +3544,7 @@
       <w:pPr>
         <w:pStyle w:val="Heading1"/>
       </w:pPr>
-      <w:bookmarkStart w:id="6" w:name="_Toc139630294"/>
+      <w:bookmarkStart w:id="13" w:name="_Toc139630294"/>
       <w:r>
         <w:t xml:space="preserve">Dose Response </w:t>
       </w:r>
@@ -3694,7 +3557,7 @@
       <w:r>
         <w:t>Post Challenge Viral Load (Section 6.3)</w:t>
       </w:r>
-      <w:bookmarkEnd w:id="6"/>
+      <w:bookmarkEnd w:id="13"/>
       <w:r>
         <w:t xml:space="preserve"> </w:t>
       </w:r>
@@ -3995,19 +3858,11 @@
           <m:t xml:space="preserve">=Intercept+ </m:t>
         </m:r>
       </m:oMath>
-      <w:proofErr w:type="spellStart"/>
-      <w:r>
-        <w:rPr>
-          <w:rFonts w:eastAsiaTheme="minorEastAsia"/>
-        </w:rPr>
-        <w:t>VaccFactor</w:t>
-      </w:r>
-      <w:proofErr w:type="spellEnd"/>
-      <w:r>
-        <w:rPr>
-          <w:rFonts w:eastAsiaTheme="minorEastAsia"/>
-        </w:rPr>
-        <w:t xml:space="preserve"> * (Dose Score).</w:t>
+      <w:r>
+        <w:rPr>
+          <w:rFonts w:eastAsiaTheme="minorEastAsia"/>
+        </w:rPr>
+        <w:t>VaccFactor * (Dose Score).</w:t>
       </w:r>
     </w:p>
     <w:p>
@@ -4020,21 +3875,7 @@
         <w:rPr>
           <w:rFonts w:eastAsiaTheme="minorEastAsia"/>
         </w:rPr>
-        <w:t xml:space="preserve">Thus, the Intercept represents the expected AUC for the placebo arm, and the Intercept plus the </w:t>
-      </w:r>
-      <w:proofErr w:type="spellStart"/>
-      <w:r>
-        <w:rPr>
-          <w:rFonts w:eastAsiaTheme="minorEastAsia"/>
-        </w:rPr>
-        <w:t>VaccFactor</w:t>
-      </w:r>
-      <w:proofErr w:type="spellEnd"/>
-      <w:r>
-        <w:rPr>
-          <w:rFonts w:eastAsiaTheme="minorEastAsia"/>
-        </w:rPr>
-        <w:t xml:space="preserve"> represents the expected AUC for the minimum dose for that vaccine. </w:t>
+        <w:t xml:space="preserve">Thus, the Intercept represents the expected AUC for the placebo arm, and the Intercept plus the VaccFactor represents the expected AUC for the minimum dose for that vaccine. </w:t>
       </w:r>
       <w:r>
         <w:rPr>
@@ -5614,21 +5455,7 @@
         <w:rPr>
           <w:rFonts w:eastAsiaTheme="minorEastAsia"/>
         </w:rPr>
-        <w:t xml:space="preserve"> within a location when changing between N1 and </w:t>
-      </w:r>
-      <w:proofErr w:type="spellStart"/>
-      <w:r>
-        <w:rPr>
-          <w:rFonts w:eastAsiaTheme="minorEastAsia"/>
-        </w:rPr>
-        <w:t>subgenomic</w:t>
-      </w:r>
-      <w:proofErr w:type="spellEnd"/>
-      <w:r>
-        <w:rPr>
-          <w:rFonts w:eastAsiaTheme="minorEastAsia"/>
-        </w:rPr>
-        <w:t xml:space="preserve"> measurements, the significance levels </w:t>
+        <w:t xml:space="preserve"> within a location when changing between N1 and subgenomic measurements, the significance levels </w:t>
       </w:r>
       <w:r>
         <w:rPr>
@@ -6050,14 +5877,14 @@
           <w:rFonts w:eastAsiaTheme="minorEastAsia"/>
         </w:rPr>
       </w:pPr>
-      <w:bookmarkStart w:id="7" w:name="_Toc139630295"/>
+      <w:bookmarkStart w:id="14" w:name="_Toc139630295"/>
       <w:r>
         <w:rPr>
           <w:rFonts w:eastAsiaTheme="minorEastAsia"/>
         </w:rPr>
         <w:t>Prediction of Post-Challenge Outcome with Single Immune Correlate (Section 6.4)</w:t>
       </w:r>
-      <w:bookmarkEnd w:id="7"/>
+      <w:bookmarkEnd w:id="14"/>
       <w:r>
         <w:rPr>
           <w:rFonts w:eastAsiaTheme="minorEastAsia"/>
@@ -6083,15 +5910,7 @@
         <w:t>with</w:t>
       </w:r>
       <w:r>
-        <w:t xml:space="preserve"> each of the 8 ways of measuring viral load using each of the 12 ways of measuring antibodies.  We considered models based on either numeric viral load or the binary viral load (i.e., the dichotomizing the viral load based on detectability into positive or negative responses), but the binary models were not particularly illuminating, so we summarize here only the numeric viral load models. Because we did not know the shape of the curves ahead of time, we used cross validation to select among several types of models (linear, exponential, segmented line regression, natural cubic splines, and 4 </w:t>
-      </w:r>
-      <w:proofErr w:type="gramStart"/>
-      <w:r>
-        <w:t>parameter</w:t>
-      </w:r>
-      <w:proofErr w:type="gramEnd"/>
-      <w:r>
-        <w:t xml:space="preserve"> logistic). Of the 96 combination</w:t>
+        <w:t xml:space="preserve"> each of the 8 ways of measuring viral load using each of the 12 ways of measuring antibodies.  We considered models based on either numeric viral load or the binary viral load (i.e., the dichotomizing the viral load based on detectability into positive or negative responses), but the binary models were not particularly illuminating, so we summarize here only the numeric viral load models. Because we did not know the shape of the curves ahead of time, we used cross validation to select among several types of models (linear, exponential, segmented line regression, natural cubic splines, and 4 parameter logistic). Of the 96 combination</w:t>
       </w:r>
       <w:r>
         <w:t>s (</w:t>
@@ -6106,13 +5925,89 @@
         <w:t xml:space="preserve"> x 12</w:t>
       </w:r>
       <w:r>
-        <w:t xml:space="preserve"> antibody measurement), in 82 pairs the best model fit was a linear model, and in the other 14 pairs the best model fit was an exponential model.  Thus, the simple models </w:t>
-      </w:r>
+        <w:t xml:space="preserve"> antibody measurement), in </w:t>
+      </w:r>
+      <w:ins w:id="15" w:author="Fay, Michael (NIH/NIAID) [E]" w:date="2026-09-24T13:30:00Z" w16du:dateUtc="2026-09-24T17:30:00Z">
+        <w:r>
+          <w:t>79</w:t>
+        </w:r>
+      </w:ins>
+      <w:del w:id="16" w:author="Fay, Michael (NIH/NIAID) [E]" w:date="2026-09-24T13:30:00Z" w16du:dateUtc="2026-09-24T17:30:00Z">
+        <w:r>
+          <w:delText>82</w:delText>
+        </w:r>
+      </w:del>
+      <w:r>
+        <w:t xml:space="preserve"> pairs the best model fit was a linear model, </w:t>
+      </w:r>
+      <w:del w:id="17" w:author="Fay, Michael (NIH/NIAID) [E]" w:date="2026-09-24T13:30:00Z" w16du:dateUtc="2026-09-24T17:30:00Z">
+        <w:r>
+          <w:delText xml:space="preserve">and </w:delText>
+        </w:r>
+      </w:del>
+      <w:r>
+        <w:t xml:space="preserve">in </w:t>
+      </w:r>
+      <w:ins w:id="18" w:author="Fay, Michael (NIH/NIAID) [E]" w:date="2026-09-24T13:30:00Z" w16du:dateUtc="2026-09-24T17:30:00Z">
+        <w:r>
+          <w:t>16</w:t>
+        </w:r>
+      </w:ins>
+      <w:del w:id="19" w:author="Fay, Michael (NIH/NIAID) [E]" w:date="2026-09-24T13:30:00Z" w16du:dateUtc="2026-09-24T17:30:00Z">
+        <w:r>
+          <w:delText>the other 14</w:delText>
+        </w:r>
+      </w:del>
+      <w:r>
+        <w:t xml:space="preserve"> pairs the best model fit was an exponential model</w:t>
+      </w:r>
+      <w:ins w:id="20" w:author="Fay, Michael (NIH/NIAID) [E]" w:date="2026-09-24T13:31:00Z" w16du:dateUtc="2026-09-24T17:31:00Z">
+        <w:r>
+          <w:t xml:space="preserve">, and in 1 pair the best fit model was a 4-parameter </w:t>
+        </w:r>
+        <w:r>
+          <w:t>logistic model</w:t>
+        </w:r>
+      </w:ins>
+      <w:r>
+        <w:t>.  Thus,</w:t>
+      </w:r>
+      <w:ins w:id="21" w:author="Fay, Michael (NIH/NIAID) [E]" w:date="2026-09-24T13:32:00Z" w16du:dateUtc="2026-09-24T17:32:00Z">
+        <w:r>
+          <w:t xml:space="preserve"> under this objecti</w:t>
+        </w:r>
+      </w:ins>
+      <w:ins w:id="22" w:author="Fay, Michael (NIH/NIAID) [E]" w:date="2026-09-24T13:33:00Z" w16du:dateUtc="2026-09-24T17:33:00Z">
+        <w:r>
+          <w:t>ve system,</w:t>
+        </w:r>
+      </w:ins>
+      <w:r>
+        <w:t xml:space="preserve"> the simple models </w:t>
+      </w:r>
+      <w:ins w:id="23" w:author="Fay, Michael (NIH/NIAID) [E]" w:date="2026-09-24T13:32:00Z" w16du:dateUtc="2026-09-24T17:32:00Z">
+        <w:r>
+          <w:t xml:space="preserve">(linear and exponential) </w:t>
+        </w:r>
+      </w:ins>
       <w:r>
         <w:t>were</w:t>
       </w:r>
       <w:r>
-        <w:t xml:space="preserve"> selected in an objective manner.</w:t>
+        <w:t xml:space="preserve"> </w:t>
+      </w:r>
+      <w:ins w:id="24" w:author="Fay, Michael (NIH/NIAID) [E]" w:date="2026-09-24T13:32:00Z" w16du:dateUtc="2026-09-24T17:32:00Z">
+        <w:r>
+          <w:t>nearly always</w:t>
+        </w:r>
+      </w:ins>
+      <w:del w:id="25" w:author="Fay, Michael (NIH/NIAID) [E]" w:date="2026-09-24T13:33:00Z" w16du:dateUtc="2026-09-24T17:33:00Z">
+        <w:r>
+          <w:delText>selected in an objective manner</w:delText>
+        </w:r>
+      </w:del>
+      <w:r>
+        <w:t>.</w:t>
       </w:r>
       <w:r>
         <w:t xml:space="preserve"> In Table 6.4.1 we give the results</w:t>
@@ -6333,13 +6228,8 @@
         <w:t>information</w:t>
       </w:r>
       <w:r>
-        <w:t xml:space="preserve"> may be </w:t>
-      </w:r>
-      <w:proofErr w:type="gramStart"/>
-      <w:r>
-        <w:t>taken into account</w:t>
-      </w:r>
-      <w:proofErr w:type="gramEnd"/>
+        <w:t xml:space="preserve"> may be taken into account</w:t>
+      </w:r>
       <w:r>
         <w:t xml:space="preserve">).   </w:t>
       </w:r>
@@ -6350,11 +6240,11 @@
       <w:pPr>
         <w:pStyle w:val="Heading1"/>
       </w:pPr>
-      <w:bookmarkStart w:id="8" w:name="_Toc139630296"/>
+      <w:bookmarkStart w:id="26" w:name="_Toc139630296"/>
       <w:r>
         <w:t>Percent of Variance Explained by Immune Correlates (Section 6.5)</w:t>
       </w:r>
-      <w:bookmarkEnd w:id="8"/>
+      <w:bookmarkEnd w:id="26"/>
       <w:r>
         <w:t xml:space="preserve"> </w:t>
       </w:r>
@@ -7037,11 +6927,11 @@
       <w:pPr>
         <w:pStyle w:val="Heading1"/>
       </w:pPr>
-      <w:bookmarkStart w:id="9" w:name="_Toc139630297"/>
+      <w:bookmarkStart w:id="27" w:name="_Toc139630297"/>
       <w:r>
         <w:t>Percent of Variance Explained by Vaccine Type and Immune Correlates (Section 6.6)</w:t>
       </w:r>
-      <w:bookmarkEnd w:id="9"/>
+      <w:bookmarkEnd w:id="27"/>
       <w:r>
         <w:t xml:space="preserve"> </w:t>
       </w:r>
@@ -7157,13 +7047,8 @@
       <w:r>
         <w:t xml:space="preserve">were </w:t>
       </w:r>
-      <w:proofErr w:type="gramStart"/>
-      <w:r>
-        <w:t>similar to</w:t>
-      </w:r>
-      <w:proofErr w:type="gramEnd"/>
-      <w:r>
-        <w:t xml:space="preserve"> the results</w:t>
+      <w:r>
+        <w:t>similar to the results</w:t>
       </w:r>
       <w:r>
         <w:t xml:space="preserve"> </w:t>
@@ -7277,15 +7162,7 @@
         <w:t>the only</w:t>
       </w:r>
       <w:r>
-        <w:t xml:space="preserve"> linear numeric effect in the linear predictor part of the generalized linear model (GLM), where the GLM is either a linear model or an exponential model depending on which fit better by cross validation), and (2) the “</w:t>
-      </w:r>
-      <w:proofErr w:type="spellStart"/>
-      <w:r>
-        <w:t>reference+extra</w:t>
-      </w:r>
-      <w:proofErr w:type="spellEnd"/>
-      <w:r>
-        <w:t>” models additionally a</w:t>
+        <w:t xml:space="preserve"> linear numeric effect in the linear predictor part of the generalized linear model (GLM), where the GLM is either a linear model or an exponential model depending on which fit better by cross validation), and (2) the “reference+extra” models additionally a</w:t>
       </w:r>
       <w:r>
         <w:t xml:space="preserve">llow different linear effects for dose for each vaccine (i.e.,  the linear predictor part of the model adds </w:t>
@@ -7300,15 +7177,7 @@
         <w:t xml:space="preserve">as well as </w:t>
       </w:r>
       <w:r>
-        <w:t>main effects for vaccine type and the interaction between vaccine type and the dose scores).  This “</w:t>
-      </w:r>
-      <w:proofErr w:type="spellStart"/>
-      <w:r>
-        <w:t>reference+extra</w:t>
-      </w:r>
-      <w:proofErr w:type="spellEnd"/>
-      <w:r>
-        <w:t>” model is different from the one described in the first paragraph of this section (</w:t>
+        <w:t>main effects for vaccine type and the interaction between vaccine type and the dose scores).  This “reference+extra” model is different from the one described in the first paragraph of this section (</w:t>
       </w:r>
       <w:r>
         <w:t xml:space="preserve">which </w:t>
@@ -7317,15 +7186,7 @@
         <w:t>h</w:t>
       </w:r>
       <w:r>
-        <w:t xml:space="preserve">as a different parameter for each dose score/vaccine combination); the new model has fewer parameters (and hence has a smaller R-squared adjustment) and treats the dose scores as linear </w:t>
-      </w:r>
-      <w:proofErr w:type="gramStart"/>
-      <w:r>
-        <w:t>effects, but</w:t>
-      </w:r>
-      <w:proofErr w:type="gramEnd"/>
-      <w:r>
-        <w:t xml:space="preserve"> allows a different linear effect for each vaccine.</w:t>
+        <w:t>as a different parameter for each dose score/vaccine combination); the new model has fewer parameters (and hence has a smaller R-squared adjustment) and treats the dose scores as linear effects, but allows a different linear effect for each vaccine.</w:t>
       </w:r>
       <w:r>
         <w:t xml:space="preserve"> Th</w:t>
@@ -7397,7 +7258,7 @@
       <w:pPr>
         <w:pStyle w:val="Heading1"/>
       </w:pPr>
-      <w:bookmarkStart w:id="10" w:name="_Toc139630298"/>
+      <w:bookmarkStart w:id="28" w:name="_Toc139630298"/>
       <w:r>
         <w:t xml:space="preserve">Possible Future Work: </w:t>
       </w:r>
@@ -7407,7 +7268,7 @@
       <w:r>
         <w:t xml:space="preserve"> (Section 6.7)</w:t>
       </w:r>
-      <w:bookmarkEnd w:id="10"/>
+      <w:bookmarkEnd w:id="28"/>
     </w:p>
     <w:p/>
     <w:p>
@@ -7426,14 +7287,14 @@
       <w:pPr>
         <w:pStyle w:val="Heading1"/>
       </w:pPr>
-      <w:bookmarkStart w:id="11" w:name="_Toc139630299"/>
+      <w:bookmarkStart w:id="29" w:name="_Toc139630299"/>
       <w:r>
         <w:t>Cross Validation Prediction Using Vaccine Product</w:t>
       </w:r>
       <w:r>
         <w:t xml:space="preserve"> (Section 6.8)</w:t>
       </w:r>
-      <w:bookmarkEnd w:id="11"/>
+      <w:bookmarkEnd w:id="29"/>
     </w:p>
     <w:p/>
     <w:p>
@@ -7483,16 +7344,11 @@
         <w:t xml:space="preserve"> the agreement between the predicted viral load with the observed viral load on the excluded animals.  </w:t>
       </w:r>
       <w:r>
-        <w:t xml:space="preserve">Agreement </w:t>
-      </w:r>
-      <w:proofErr w:type="gramStart"/>
-      <w:r>
-        <w:t xml:space="preserve">coefficients </w:t>
+        <w:t xml:space="preserve">Agreement coefficients </w:t>
       </w:r>
       <w:r>
         <w:t xml:space="preserve"> are</w:t>
       </w:r>
-      <w:proofErr w:type="gramEnd"/>
       <w:r>
         <w:t xml:space="preserve"> </w:t>
       </w:r>
@@ -7557,23 +7413,7 @@
         <w:t xml:space="preserve">. </w:t>
       </w:r>
       <w:r>
-        <w:t xml:space="preserve">Of the two viral load measurement methods (N1 and </w:t>
-      </w:r>
-      <w:proofErr w:type="spellStart"/>
-      <w:r>
-        <w:t>subgenomic</w:t>
-      </w:r>
-      <w:proofErr w:type="spellEnd"/>
-      <w:r>
-        <w:t xml:space="preserve">), N1 has fewer undetectable values, hence it generally provides better agreement than the </w:t>
-      </w:r>
-      <w:proofErr w:type="spellStart"/>
-      <w:r>
-        <w:t>subgenomic</w:t>
-      </w:r>
-      <w:proofErr w:type="spellEnd"/>
-      <w:r>
-        <w:t xml:space="preserve"> for the numeric analyses.</w:t>
+        <w:t>Of the two viral load measurement methods (N1 and subgenomic), N1 has fewer undetectable values, hence it generally provides better agreement than the subgenomic for the numeric analyses.</w:t>
       </w:r>
       <w:r>
         <w:t xml:space="preserve"> See Tables 6.8.1-6.8.4 for the results for the 4 cross-validation procedures for each of the 12 ways of measuring viral load and 8 ways of measuring antibody.  </w:t>
@@ -7702,16 +7542,11 @@
       <w:r>
         <w:t xml:space="preserve"> 0. </w:t>
       </w:r>
-      <w:proofErr w:type="gramStart"/>
       <w:r>
         <w:t xml:space="preserve">Further </w:t>
       </w:r>
       <w:r>
-        <w:t>,</w:t>
-      </w:r>
-      <w:proofErr w:type="gramEnd"/>
-      <w:r>
-        <w:t xml:space="preserve"> for Novavax, the concordance estimate </w:t>
+        <w:t xml:space="preserve">, for Novavax, the concordance estimate </w:t>
       </w:r>
       <w:r>
         <w:t>wa</w:t>
@@ -7768,11 +7603,7 @@
         <w:t>second-best</w:t>
       </w:r>
       <w:r>
-        <w:t xml:space="preserve"> average (</w:t>
-      </w:r>
-      <w:proofErr w:type="spellStart"/>
-      <w:r>
-        <w:t>CC</w:t>
+        <w:t xml:space="preserve"> average (CC</w:t>
       </w:r>
       <w:r>
         <w:rPr>
@@ -7780,7 +7611,6 @@
         </w:rPr>
         <w:t>avg</w:t>
       </w:r>
-      <w:proofErr w:type="spellEnd"/>
       <w:r>
         <w:t xml:space="preserve">=0.4350), and it was </w:t>
       </w:r>
@@ -7794,11 +7624,7 @@
         <w:t>Day-2-post-challenge-Nasal-sawb-N1/PsVNA-ID80-day-challenge</w:t>
       </w:r>
       <w:r>
-        <w:t xml:space="preserve"> which had a slightly higher average (</w:t>
-      </w:r>
-      <w:proofErr w:type="spellStart"/>
-      <w:r>
-        <w:t>CC</w:t>
+        <w:t xml:space="preserve"> which had a slightly higher average (CC</w:t>
       </w:r>
       <w:r>
         <w:rPr>
@@ -7806,7 +7632,6 @@
         </w:rPr>
         <w:t>avg</w:t>
       </w:r>
-      <w:proofErr w:type="spellEnd"/>
       <w:r>
         <w:t>=0.4375). For the latter pair, the agreement among the 4 vaccines was not too different than for the AUC-BAL-N1/log-MN-day-challenge pair (see Tables 6.8.1-6.8.4).</w:t>
       </w:r>
@@ -7887,14 +7712,14 @@
       <w:pPr>
         <w:pStyle w:val="Heading1"/>
       </w:pPr>
-      <w:bookmarkStart w:id="12" w:name="_Toc139630300"/>
+      <w:bookmarkStart w:id="30" w:name="_Toc139630300"/>
       <w:r>
         <w:t xml:space="preserve">Possible Future Work: </w:t>
       </w:r>
       <w:r>
         <w:t>Comparison with the Human Correlates Studies (Section 6.9)</w:t>
       </w:r>
-      <w:bookmarkEnd w:id="12"/>
+      <w:bookmarkEnd w:id="30"/>
     </w:p>
     <w:p/>
     <w:p>
@@ -7907,7 +7732,7 @@
       <w:pPr>
         <w:pStyle w:val="Heading1"/>
       </w:pPr>
-      <w:bookmarkStart w:id="13" w:name="_Toc139630301"/>
+      <w:bookmarkStart w:id="31" w:name="_Toc139630301"/>
       <w:r>
         <w:t xml:space="preserve">Possible Future Work: </w:t>
       </w:r>
@@ -7917,7 +7742,7 @@
       <w:r>
         <w:t xml:space="preserve"> (Section 6.10)</w:t>
       </w:r>
-      <w:bookmarkEnd w:id="13"/>
+      <w:bookmarkEnd w:id="31"/>
     </w:p>
     <w:p/>
     <w:p>
@@ -7938,7 +7763,7 @@
 </file>
 
 <file path=word/numbering.xml><?xml version="1.0" encoding="utf-8"?>
-<w:numbering xmlns:wpc="http://schemas.microsoft.com/office/word/2010/wordprocessingCanvas" xmlns:cx="http://schemas.microsoft.com/office/drawing/2014/chartex" xmlns:cx1="http://schemas.microsoft.com/office/drawing/2015/9/8/chartex" xmlns:cx2="http://schemas.microsoft.com/office/drawing/2015/10/21/chartex" xmlns:cx3="http://schemas.microsoft.com/office/drawing/2016/5/9/chartex" xmlns:cx4="http://schemas.microsoft.com/office/drawing/2016/5/10/chartex" xmlns:cx5="http://schemas.microsoft.com/office/drawing/2016/5/11/chartex" xmlns:cx6="http://schemas.microsoft.com/office/drawing/2016/5/12/chartex" xmlns:cx7="http://schemas.microsoft.com/office/drawing/2016/5/13/chartex" xmlns:cx8="http://schemas.microsoft.com/office/drawing/2016/5/14/chartex" xmlns:mc="http://schemas.openxmlformats.org/markup-compatibility/2006" xmlns:aink="http://schemas.microsoft.com/office/drawing/2016/ink" xmlns:am3d="http://schemas.microsoft.com/office/drawing/2017/model3d" xmlns:o="urn:schemas-microsoft-com:office:office" xmlns:oel="http://schemas.microsoft.com/office/2019/extlst" xmlns:r="http://schemas.openxmlformats.org/officeDocument/2006/relationships" xmlns:m="http://schemas.openxmlformats.org/officeDocument/2006/math" xmlns:v="urn:schemas-microsoft-com:vml" xmlns:wp14="http://schemas.microsoft.com/office/word/2010/wordprocessingDrawing" xmlns:wp="http://schemas.openxmlformats.org/drawingml/2006/wordprocessingDrawing" xmlns:w10="urn:schemas-microsoft-com:office:word" xmlns:w="http://schemas.openxmlformats.org/wordprocessingml/2006/main" xmlns:w14="http://schemas.microsoft.com/office/word/2010/wordml" xmlns:w15="http://schemas.microsoft.com/office/word/2012/wordml" xmlns:w16cex="http://schemas.microsoft.com/office/word/2018/wordml/cex" xmlns:w16cid="http://schemas.microsoft.com/office/word/2016/wordml/cid" xmlns:w16="http://schemas.microsoft.com/office/word/2018/wordml" xmlns:w16sdtdh="http://schemas.microsoft.com/office/word/2020/wordml/sdtdatahash" xmlns:w16se="http://schemas.microsoft.com/office/word/2015/wordml/symex" xmlns:wpg="http://schemas.microsoft.com/office/word/2010/wordprocessingGroup" xmlns:wpi="http://schemas.microsoft.com/office/word/2010/wordprocessingInk" xmlns:wne="http://schemas.microsoft.com/office/word/2006/wordml" xmlns:wps="http://schemas.microsoft.com/office/word/2010/wordprocessingShape" mc:Ignorable="w14 w15 w16se w16cid w16 w16cex w16sdtdh wp14">
+<w:numbering xmlns:wpc="http://schemas.microsoft.com/office/word/2010/wordprocessingCanvas" xmlns:cx="http://schemas.microsoft.com/office/drawing/2014/chartex" xmlns:cx1="http://schemas.microsoft.com/office/drawing/2015/9/8/chartex" xmlns:cx2="http://schemas.microsoft.com/office/drawing/2015/10/21/chartex" xmlns:cx3="http://schemas.microsoft.com/office/drawing/2016/5/9/chartex" xmlns:cx4="http://schemas.microsoft.com/office/drawing/2016/5/10/chartex" xmlns:cx5="http://schemas.microsoft.com/office/drawing/2016/5/11/chartex" xmlns:cx6="http://schemas.microsoft.com/office/drawing/2016/5/12/chartex" xmlns:cx7="http://schemas.microsoft.com/office/drawing/2016/5/13/chartex" xmlns:cx8="http://schemas.microsoft.com/office/drawing/2016/5/14/chartex" xmlns:mc="http://schemas.openxmlformats.org/markup-compatibility/2006" xmlns:aink="http://schemas.microsoft.com/office/drawing/2016/ink" xmlns:am3d="http://schemas.microsoft.com/office/drawing/2017/model3d" xmlns:o="urn:schemas-microsoft-com:office:office" xmlns:oel="http://schemas.microsoft.com/office/2019/extlst" xmlns:r="http://schemas.openxmlformats.org/officeDocument/2006/relationships" xmlns:m="http://schemas.openxmlformats.org/officeDocument/2006/math" xmlns:v="urn:schemas-microsoft-com:vml" xmlns:wp14="http://schemas.microsoft.com/office/word/2010/wordprocessingDrawing" xmlns:wp="http://schemas.openxmlformats.org/drawingml/2006/wordprocessingDrawing" xmlns:w10="urn:schemas-microsoft-com:office:word" xmlns:w="http://schemas.openxmlformats.org/wordprocessingml/2006/main" xmlns:w14="http://schemas.microsoft.com/office/word/2010/wordml" xmlns:w15="http://schemas.microsoft.com/office/word/2012/wordml" xmlns:w16cex="http://schemas.microsoft.com/office/word/2018/wordml/cex" xmlns:w16cid="http://schemas.microsoft.com/office/word/2016/wordml/cid" xmlns:w16="http://schemas.microsoft.com/office/word/2018/wordml" xmlns:w16du="http://schemas.microsoft.com/office/word/2023/wordml/word16du" xmlns:w16sdtdh="http://schemas.microsoft.com/office/word/2020/wordml/sdtdatahash" xmlns:w16sdtfl="http://schemas.microsoft.com/office/word/2024/wordml/sdtformatlock" xmlns:w16se="http://schemas.microsoft.com/office/word/2015/wordml/symex" xmlns:wpg="http://schemas.microsoft.com/office/word/2010/wordprocessingGroup" xmlns:wpi="http://schemas.microsoft.com/office/word/2010/wordprocessingInk" xmlns:wne="http://schemas.microsoft.com/office/word/2006/wordml" xmlns:wps="http://schemas.microsoft.com/office/word/2010/wordprocessingShape" mc:Ignorable="w14 w15 w16se w16cid w16 w16cex w16sdtdh w16sdtfl w16du wp14">
   <w:abstractNum w:abstractNumId="0" w15:restartNumberingAfterBreak="0">
     <w:nsid w:val="0DB91D9D"/>
     <w:multiLevelType w:val="hybridMultilevel"/>
@@ -8614,8 +8439,16 @@
 </w:numbering>
 </file>
 
+<file path=word/people.xml><?xml version="1.0" encoding="utf-8"?>
+<w15:people xmlns:wpc="http://schemas.microsoft.com/office/word/2010/wordprocessingCanvas" xmlns:cx="http://schemas.microsoft.com/office/drawing/2014/chartex" xmlns:cx1="http://schemas.microsoft.com/office/drawing/2015/9/8/chartex" xmlns:cx2="http://schemas.microsoft.com/office/drawing/2015/10/21/chartex" xmlns:cx3="http://schemas.microsoft.com/office/drawing/2016/5/9/chartex" xmlns:cx4="http://schemas.microsoft.com/office/drawing/2016/5/10/chartex" xmlns:cx5="http://schemas.microsoft.com/office/drawing/2016/5/11/chartex" xmlns:cx6="http://schemas.microsoft.com/office/drawing/2016/5/12/chartex" xmlns:cx7="http://schemas.microsoft.com/office/drawing/2016/5/13/chartex" xmlns:cx8="http://schemas.microsoft.com/office/drawing/2016/5/14/chartex" xmlns:mc="http://schemas.openxmlformats.org/markup-compatibility/2006" xmlns:aink="http://schemas.microsoft.com/office/drawing/2016/ink" xmlns:am3d="http://schemas.microsoft.com/office/drawing/2017/model3d" xmlns:o="urn:schemas-microsoft-com:office:office" xmlns:oel="http://schemas.microsoft.com/office/2019/extlst" xmlns:r="http://schemas.openxmlformats.org/officeDocument/2006/relationships" xmlns:m="http://schemas.openxmlformats.org/officeDocument/2006/math" xmlns:v="urn:schemas-microsoft-com:vml" xmlns:wp14="http://schemas.microsoft.com/office/word/2010/wordprocessingDrawing" xmlns:wp="http://schemas.openxmlformats.org/drawingml/2006/wordprocessingDrawing" xmlns:w10="urn:schemas-microsoft-com:office:word" xmlns:w="http://schemas.openxmlformats.org/wordprocessingml/2006/main" xmlns:w14="http://schemas.microsoft.com/office/word/2010/wordml" xmlns:w15="http://schemas.microsoft.com/office/word/2012/wordml" xmlns:w16cex="http://schemas.microsoft.com/office/word/2018/wordml/cex" xmlns:w16cid="http://schemas.microsoft.com/office/word/2016/wordml/cid" xmlns:w16="http://schemas.microsoft.com/office/word/2018/wordml" xmlns:w16du="http://schemas.microsoft.com/office/word/2023/wordml/word16du" xmlns:w16sdtdh="http://schemas.microsoft.com/office/word/2020/wordml/sdtdatahash" xmlns:w16sdtfl="http://schemas.microsoft.com/office/word/2024/wordml/sdtformatlock" xmlns:w16se="http://schemas.microsoft.com/office/word/2015/wordml/symex" xmlns:wpg="http://schemas.microsoft.com/office/word/2010/wordprocessingGroup" xmlns:wpi="http://schemas.microsoft.com/office/word/2010/wordprocessingInk" xmlns:wne="http://schemas.microsoft.com/office/word/2006/wordml" xmlns:wps="http://schemas.microsoft.com/office/word/2010/wordprocessingShape" mc:Ignorable="w14 w15 w16se w16cid w16 w16cex w16sdtdh w16sdtfl w16du wp14">
+  <w15:person w15:author="Fay, Michael (NIH/NIAID) [E]">
+    <w15:presenceInfo w15:providerId="AD" w15:userId="S::faym@nih.gov::aa88119c-1f60-480a-9c65-5f16fad15a55"/>
+  </w15:person>
+</w15:people>
+</file>
+
 <file path=word/styles.xml><?xml version="1.0" encoding="utf-8"?>
-<w:styles xmlns:mc="http://schemas.openxmlformats.org/markup-compatibility/2006" xmlns:r="http://schemas.openxmlformats.org/officeDocument/2006/relationships" xmlns:w="http://schemas.openxmlformats.org/wordprocessingml/2006/main" xmlns:w14="http://schemas.microsoft.com/office/word/2010/wordml" xmlns:w15="http://schemas.microsoft.com/office/word/2012/wordml" xmlns:w16cex="http://schemas.microsoft.com/office/word/2018/wordml/cex" xmlns:w16cid="http://schemas.microsoft.com/office/word/2016/wordml/cid" xmlns:w16="http://schemas.microsoft.com/office/word/2018/wordml" xmlns:w16sdtdh="http://schemas.microsoft.com/office/word/2020/wordml/sdtdatahash" xmlns:w16se="http://schemas.microsoft.com/office/word/2015/wordml/symex" mc:Ignorable="w14 w15 w16se w16cid w16 w16cex w16sdtdh">
+<w:styles xmlns:mc="http://schemas.openxmlformats.org/markup-compatibility/2006" xmlns:r="http://schemas.openxmlformats.org/officeDocument/2006/relationships" xmlns:w="http://schemas.openxmlformats.org/wordprocessingml/2006/main" xmlns:w14="http://schemas.microsoft.com/office/word/2010/wordml" xmlns:w15="http://schemas.microsoft.com/office/word/2012/wordml" xmlns:w16cex="http://schemas.microsoft.com/office/word/2018/wordml/cex" xmlns:w16cid="http://schemas.microsoft.com/office/word/2016/wordml/cid" xmlns:w16="http://schemas.microsoft.com/office/word/2018/wordml" xmlns:w16du="http://schemas.microsoft.com/office/word/2023/wordml/word16du" xmlns:w16sdtdh="http://schemas.microsoft.com/office/word/2020/wordml/sdtdatahash" xmlns:w16sdtfl="http://schemas.microsoft.com/office/word/2024/wordml/sdtformatlock" xmlns:w16se="http://schemas.microsoft.com/office/word/2015/wordml/symex" mc:Ignorable="w14 w15 w16se w16cid w16 w16cex w16sdtdh w16sdtfl w16du">
   <w:docDefaults>
     <w:rPrDefault>
       <w:rPr>
@@ -9625,6 +9458,27 @@
 </file>
 
 <file path=customXml/item1.xml><?xml version="1.0" encoding="utf-8"?>
+<p:properties xmlns:p="http://schemas.microsoft.com/office/2006/metadata/properties" xmlns:xsi="http://www.w3.org/2001/XMLSchema-instance" xmlns:pc="http://schemas.microsoft.com/office/infopath/2007/PartnerControls">
+  <documentManagement>
+    <FileDescription xmlns="fce774b4-c9d4-4a8f-80fc-e2982472d72a" xsi:nil="true"/>
+  </documentManagement>
+</p:properties>
+</file>
+
+<file path=customXml/item2.xml><?xml version="1.0" encoding="utf-8"?>
+<b:Sources xmlns:b="http://schemas.openxmlformats.org/officeDocument/2006/bibliography" xmlns="http://schemas.openxmlformats.org/officeDocument/2006/bibliography" SelectedStyle="\APASixthEditionOfficeOnline.xsl" StyleName="APA" Version="6"/>
+</file>
+
+<file path=customXml/item3.xml><?xml version="1.0" encoding="utf-8"?>
+<?mso-contentType ?>
+<FormTemplates xmlns="http://schemas.microsoft.com/sharepoint/v3/contenttype/forms">
+  <Display>DocumentLibraryForm</Display>
+  <Edit>DocumentLibraryForm</Edit>
+  <New>DocumentLibraryForm</New>
+</FormTemplates>
+</file>
+
+<file path=customXml/item4.xml><?xml version="1.0" encoding="utf-8"?>
 <ct:contentTypeSchema xmlns:ct="http://schemas.microsoft.com/office/2006/metadata/contentType" xmlns:ma="http://schemas.microsoft.com/office/2006/metadata/properties/metaAttributes" ct:_="" ma:_="" ma:contentTypeName="Document" ma:contentTypeID="0x0101003A2D0302CE78CC4BB13800D8CA71650E" ma:contentTypeVersion="11" ma:contentTypeDescription="Create a new document." ma:contentTypeScope="" ma:versionID="f2a6e62740645175611e42e0aa2ee0d4">
   <xsd:schema xmlns:xsd="http://www.w3.org/2001/XMLSchema" xmlns:xs="http://www.w3.org/2001/XMLSchema" xmlns:p="http://schemas.microsoft.com/office/2006/metadata/properties" xmlns:ns2="fce774b4-c9d4-4a8f-80fc-e2982472d72a" xmlns:ns3="a2d2812d-be11-456f-89bb-f2744f6d5ca3" targetNamespace="http://schemas.microsoft.com/office/2006/metadata/properties" ma:root="true" ma:fieldsID="9b826cb3f412dd76fe817162839d6b49" ns2:_="" ns3:_="">
     <xsd:import namespace="fce774b4-c9d4-4a8f-80fc-e2982472d72a"/>
@@ -9835,28 +9689,33 @@
 </ct:contentTypeSchema>
 </file>
 
-<file path=customXml/item2.xml><?xml version="1.0" encoding="utf-8"?>
-<?mso-contentType ?>
-<FormTemplates xmlns="http://schemas.microsoft.com/sharepoint/v3/contenttype/forms">
-  <Display>DocumentLibraryForm</Display>
-  <Edit>DocumentLibraryForm</Edit>
-  <New>DocumentLibraryForm</New>
-</FormTemplates>
+<file path=customXml/itemProps1.xml><?xml version="1.0" encoding="utf-8"?>
+<ds:datastoreItem xmlns:ds="http://schemas.openxmlformats.org/officeDocument/2006/customXml" ds:itemID="{6CBC435F-7829-41CA-9357-3E3BB245523D}">
+  <ds:schemaRefs>
+    <ds:schemaRef ds:uri="http://schemas.microsoft.com/office/2006/metadata/properties"/>
+    <ds:schemaRef ds:uri="http://schemas.microsoft.com/office/infopath/2007/PartnerControls"/>
+    <ds:schemaRef ds:uri="fce774b4-c9d4-4a8f-80fc-e2982472d72a"/>
+  </ds:schemaRefs>
+</ds:datastoreItem>
 </file>
 
-<file path=customXml/item3.xml><?xml version="1.0" encoding="utf-8"?>
-<b:Sources xmlns:b="http://schemas.openxmlformats.org/officeDocument/2006/bibliography" xmlns="http://schemas.openxmlformats.org/officeDocument/2006/bibliography" SelectedStyle="\APASixthEditionOfficeOnline.xsl" StyleName="APA" Version="6"/>
+<file path=customXml/itemProps2.xml><?xml version="1.0" encoding="utf-8"?>
+<ds:datastoreItem xmlns:ds="http://schemas.openxmlformats.org/officeDocument/2006/customXml" ds:itemID="{DCA312BE-4485-44E7-9A50-CF1F99F76A5B}">
+  <ds:schemaRefs>
+    <ds:schemaRef ds:uri="http://schemas.openxmlformats.org/officeDocument/2006/bibliography"/>
+  </ds:schemaRefs>
+</ds:datastoreItem>
 </file>
 
-<file path=customXml/item4.xml><?xml version="1.0" encoding="utf-8"?>
-<p:properties xmlns:p="http://schemas.microsoft.com/office/2006/metadata/properties" xmlns:xsi="http://www.w3.org/2001/XMLSchema-instance" xmlns:pc="http://schemas.microsoft.com/office/infopath/2007/PartnerControls">
-  <documentManagement>
-    <FileDescription xmlns="fce774b4-c9d4-4a8f-80fc-e2982472d72a" xsi:nil="true"/>
-  </documentManagement>
-</p:properties>
+<file path=customXml/itemProps3.xml><?xml version="1.0" encoding="utf-8"?>
+<ds:datastoreItem xmlns:ds="http://schemas.openxmlformats.org/officeDocument/2006/customXml" ds:itemID="{A2B0ADF6-1A7B-4B70-BD19-6C56455B42D8}">
+  <ds:schemaRefs>
+    <ds:schemaRef ds:uri="http://schemas.microsoft.com/sharepoint/v3/contenttype/forms"/>
+  </ds:schemaRefs>
+</ds:datastoreItem>
 </file>
 
-<file path=customXml/itemProps1.xml><?xml version="1.0" encoding="utf-8"?>
+<file path=customXml/itemProps4.xml><?xml version="1.0" encoding="utf-8"?>
 <ds:datastoreItem xmlns:ds="http://schemas.openxmlformats.org/officeDocument/2006/customXml" ds:itemID="{89C730CC-CABE-44E6-BD55-15F64A6A1F14}">
   <ds:schemaRefs>
     <ds:schemaRef ds:uri="http://schemas.microsoft.com/office/2006/metadata/contentType"/>
@@ -9875,32 +9734,6 @@
 </ds:datastoreItem>
 </file>
 
-<file path=customXml/itemProps2.xml><?xml version="1.0" encoding="utf-8"?>
-<ds:datastoreItem xmlns:ds="http://schemas.openxmlformats.org/officeDocument/2006/customXml" ds:itemID="{A2B0ADF6-1A7B-4B70-BD19-6C56455B42D8}">
-  <ds:schemaRefs>
-    <ds:schemaRef ds:uri="http://schemas.microsoft.com/sharepoint/v3/contenttype/forms"/>
-  </ds:schemaRefs>
-</ds:datastoreItem>
-</file>
-
-<file path=customXml/itemProps3.xml><?xml version="1.0" encoding="utf-8"?>
-<ds:datastoreItem xmlns:ds="http://schemas.openxmlformats.org/officeDocument/2006/customXml" ds:itemID="{DCA312BE-4485-44E7-9A50-CF1F99F76A5B}">
-  <ds:schemaRefs>
-    <ds:schemaRef ds:uri="http://schemas.openxmlformats.org/officeDocument/2006/bibliography"/>
-  </ds:schemaRefs>
-</ds:datastoreItem>
-</file>
-
-<file path=customXml/itemProps4.xml><?xml version="1.0" encoding="utf-8"?>
-<ds:datastoreItem xmlns:ds="http://schemas.openxmlformats.org/officeDocument/2006/customXml" ds:itemID="{6CBC435F-7829-41CA-9357-3E3BB245523D}">
-  <ds:schemaRefs>
-    <ds:schemaRef ds:uri="http://schemas.microsoft.com/office/2006/metadata/properties"/>
-    <ds:schemaRef ds:uri="http://schemas.microsoft.com/office/infopath/2007/PartnerControls"/>
-    <ds:schemaRef ds:uri="fce774b4-c9d4-4a8f-80fc-e2982472d72a"/>
-  </ds:schemaRefs>
-</ds:datastoreItem>
-</file>
-
 <file path=docMetadata/LabelInfo.xml><?xml version="1.0" encoding="utf-8"?>
 <clbl:labelList xmlns:clbl="http://schemas.microsoft.com/office/2020/mipLabelMetadata">
   <clbl:label id="{14b77578-9773-42d5-8507-251ca2dc2b06}" enabled="0" method="" siteId="{14b77578-9773-42d5-8507-251ca2dc2b06}" removed="1"/>

</xml_diff>